<commit_message>
list 2 buisness rules
</commit_message>
<xml_diff>
--- a/Spr02HD-280556-Tereba - 2026.docx
+++ b/Spr02HD-280556-Tereba - 2026.docx
@@ -30,6 +30,7 @@
         </w:rPr>
         <w:t xml:space="preserve"> – </w:t>
       </w:r>
+      <w:proofErr w:type="spellStart"/>
       <w:r>
         <w:rPr>
           <w:rFonts w:ascii="Courier New" w:hAnsi="Courier New" w:cs="Courier New"/>
@@ -39,6 +40,7 @@
         </w:rPr>
         <w:t>Spr</w:t>
       </w:r>
+      <w:proofErr w:type="spellEnd"/>
       <w:r>
         <w:rPr>
           <w:rFonts w:ascii="Courier New" w:hAnsi="Courier New" w:cs="Courier New"/>
@@ -127,18 +129,34 @@
           <w:sz w:val="20"/>
         </w:rPr>
       </w:pPr>
+      <w:proofErr w:type="spellStart"/>
       <w:r>
         <w:rPr>
           <w:sz w:val="20"/>
         </w:rPr>
-        <w:t>PWr. WI</w:t>
-      </w:r>
+        <w:t>PWr</w:t>
+      </w:r>
+      <w:proofErr w:type="spellEnd"/>
       <w:r>
         <w:rPr>
           <w:sz w:val="20"/>
         </w:rPr>
+        <w:t xml:space="preserve">. </w:t>
+      </w:r>
+      <w:proofErr w:type="spellStart"/>
+      <w:r>
+        <w:rPr>
+          <w:sz w:val="20"/>
+        </w:rPr>
+        <w:t>WI</w:t>
+      </w:r>
+      <w:r>
+        <w:rPr>
+          <w:sz w:val="20"/>
+        </w:rPr>
         <w:t>iT</w:t>
       </w:r>
+      <w:proofErr w:type="spellEnd"/>
       <w:r>
         <w:rPr>
           <w:sz w:val="20"/>
@@ -3403,6 +3421,66 @@
         </w:rPr>
         <w:br/>
       </w:r>
+      <w:r>
+        <w:rPr>
+          <w:b/>
+          <w:bCs/>
+          <w:sz w:val="24"/>
+        </w:rPr>
+        <w:t>S</w:t>
+      </w:r>
+      <w:r>
+        <w:rPr>
+          <w:b/>
+          <w:bCs/>
+          <w:sz w:val="24"/>
+        </w:rPr>
+        <w:t>pecjalizacj</w:t>
+      </w:r>
+      <w:r>
+        <w:rPr>
+          <w:b/>
+          <w:bCs/>
+          <w:sz w:val="24"/>
+        </w:rPr>
+        <w:t>a</w:t>
+      </w:r>
+      <w:r>
+        <w:rPr>
+          <w:sz w:val="24"/>
+        </w:rPr>
+        <w:t xml:space="preserve"> </w:t>
+      </w:r>
+      <w:r>
+        <w:rPr>
+          <w:sz w:val="24"/>
+        </w:rPr>
+        <w:t>–</w:t>
+      </w:r>
+      <w:r>
+        <w:rPr>
+          <w:sz w:val="24"/>
+        </w:rPr>
+        <w:t xml:space="preserve"> ściśle określon</w:t>
+      </w:r>
+      <w:r>
+        <w:rPr>
+          <w:sz w:val="24"/>
+        </w:rPr>
+        <w:t>y</w:t>
+      </w:r>
+      <w:r>
+        <w:rPr>
+          <w:sz w:val="24"/>
+        </w:rPr>
+        <w:t xml:space="preserve"> prawem i standardami medycznymi obszar praktyki lekarskiej.</w:t>
+      </w:r>
+      <w:r>
+        <w:rPr>
+          <w:sz w:val="24"/>
+        </w:rPr>
+        <w:br/>
+      </w:r>
     </w:p>
     <w:p>
       <w:pPr>
@@ -3881,6 +3959,77 @@
                 <w:sz w:val="24"/>
               </w:rPr>
               <w:t>Rozpoznanie stanu zdrowia pacjenta dokonane przez lekarza, przypisujące konkretną chorobę wraz z datą i ewentualnymi zaleceniami.</w:t>
+            </w:r>
+          </w:p>
+        </w:tc>
+      </w:tr>
+      <w:tr>
+        <w:tc>
+          <w:tcPr>
+            <w:tcW w:w="562" w:type="dxa"/>
+          </w:tcPr>
+          <w:p>
+            <w:pPr>
+              <w:spacing w:after="0" w:line="240" w:lineRule="auto"/>
+              <w:rPr>
+                <w:sz w:val="24"/>
+              </w:rPr>
+            </w:pPr>
+            <w:r>
+              <w:rPr>
+                <w:sz w:val="24"/>
+              </w:rPr>
+              <w:t>7.</w:t>
+            </w:r>
+          </w:p>
+        </w:tc>
+        <w:tc>
+          <w:tcPr>
+            <w:tcW w:w="1843" w:type="dxa"/>
+          </w:tcPr>
+          <w:p>
+            <w:pPr>
+              <w:spacing w:after="0" w:line="240" w:lineRule="auto"/>
+              <w:rPr>
+                <w:sz w:val="24"/>
+              </w:rPr>
+            </w:pPr>
+            <w:r>
+              <w:rPr>
+                <w:sz w:val="24"/>
+              </w:rPr>
+              <w:t>Specjalizacja</w:t>
+            </w:r>
+          </w:p>
+        </w:tc>
+        <w:tc>
+          <w:tcPr>
+            <w:tcW w:w="7273" w:type="dxa"/>
+          </w:tcPr>
+          <w:p>
+            <w:pPr>
+              <w:spacing w:after="0" w:line="240" w:lineRule="auto"/>
+              <w:rPr>
+                <w:sz w:val="24"/>
+              </w:rPr>
+            </w:pPr>
+            <w:r>
+              <w:rPr>
+                <w:sz w:val="24"/>
+              </w:rPr>
+              <w:t>Wyodrębniony, usystematyzowany dział medycyny</w:t>
+            </w:r>
+            <w:r>
+              <w:rPr>
+                <w:sz w:val="24"/>
+              </w:rPr>
+              <w:t xml:space="preserve"> </w:t>
+            </w:r>
+            <w:r>
+              <w:rPr>
+                <w:sz w:val="24"/>
+              </w:rPr>
+              <w:t>oparty na oficjalnych rejestrach</w:t>
             </w:r>
           </w:p>
         </w:tc>
@@ -4079,32 +4228,84 @@
               <w:rPr>
                 <w:sz w:val="24"/>
               </w:rPr>
-              <w:t xml:space="preserve">nazwa, adres, </w:t>
-            </w:r>
-            <w:r>
-              <w:rPr>
-                <w:sz w:val="24"/>
-              </w:rPr>
-              <w:t xml:space="preserve">kod pocztowy, </w:t>
-            </w:r>
-            <w:r>
-              <w:rPr>
-                <w:sz w:val="24"/>
-              </w:rPr>
-              <w:t>numer</w:t>
-            </w:r>
-            <w:r>
-              <w:rPr>
-                <w:sz w:val="24"/>
-              </w:rPr>
-              <w:t xml:space="preserve"> </w:t>
-            </w:r>
-            <w:r>
-              <w:rPr>
-                <w:sz w:val="24"/>
-              </w:rPr>
-              <w:t>telefonu</w:t>
-            </w:r>
+              <w:t>N</w:t>
+            </w:r>
+            <w:r>
+              <w:rPr>
+                <w:sz w:val="24"/>
+              </w:rPr>
+              <w:t xml:space="preserve">azwa, </w:t>
+            </w:r>
+            <w:r>
+              <w:rPr>
+                <w:sz w:val="24"/>
+              </w:rPr>
+              <w:t>A</w:t>
+            </w:r>
+            <w:r>
+              <w:rPr>
+                <w:sz w:val="24"/>
+              </w:rPr>
+              <w:t xml:space="preserve">dres, </w:t>
+            </w:r>
+            <w:proofErr w:type="spellStart"/>
+            <w:r>
+              <w:rPr>
+                <w:sz w:val="24"/>
+              </w:rPr>
+              <w:t>K</w:t>
+            </w:r>
+            <w:r>
+              <w:rPr>
+                <w:sz w:val="24"/>
+              </w:rPr>
+              <w:t>od</w:t>
+            </w:r>
+            <w:r>
+              <w:rPr>
+                <w:sz w:val="24"/>
+              </w:rPr>
+              <w:t>P</w:t>
+            </w:r>
+            <w:r>
+              <w:rPr>
+                <w:sz w:val="24"/>
+              </w:rPr>
+              <w:t>ocztowy</w:t>
+            </w:r>
+            <w:proofErr w:type="spellEnd"/>
+            <w:r>
+              <w:rPr>
+                <w:sz w:val="24"/>
+              </w:rPr>
+              <w:t xml:space="preserve">, </w:t>
+            </w:r>
+            <w:proofErr w:type="spellStart"/>
+            <w:r>
+              <w:rPr>
+                <w:sz w:val="24"/>
+              </w:rPr>
+              <w:t>N</w:t>
+            </w:r>
+            <w:r>
+              <w:rPr>
+                <w:sz w:val="24"/>
+              </w:rPr>
+              <w:t>umer</w:t>
+            </w:r>
+            <w:r>
+              <w:rPr>
+                <w:sz w:val="24"/>
+              </w:rPr>
+              <w:t>T</w:t>
+            </w:r>
+            <w:r>
+              <w:rPr>
+                <w:sz w:val="24"/>
+              </w:rPr>
+              <w:t>elefonu</w:t>
+            </w:r>
+            <w:proofErr w:type="spellEnd"/>
             <w:r>
               <w:rPr>
                 <w:sz w:val="24"/>
@@ -4212,7 +4413,19 @@
               <w:rPr>
                 <w:sz w:val="24"/>
               </w:rPr>
-              <w:t>Szpital + kod specjalizacji</w:t>
+              <w:t>{Regon szpitala,</w:t>
+            </w:r>
+            <w:r>
+              <w:rPr>
+                <w:sz w:val="24"/>
+              </w:rPr>
+              <w:t xml:space="preserve"> kod specjalizacji</w:t>
+            </w:r>
+            <w:r>
+              <w:rPr>
+                <w:sz w:val="24"/>
+              </w:rPr>
+              <w:t>}</w:t>
             </w:r>
           </w:p>
         </w:tc>
@@ -4283,7 +4496,14 @@
               <w:rPr>
                 <w:sz w:val="24"/>
               </w:rPr>
-              <w:t>, numer prawa wykonywania zawodu, data urodzenia, data zatrudnienia, adres, numer telefonu</w:t>
+              <w:t xml:space="preserve">, numer prawa wykonywania zawodu, data </w:t>
+            </w:r>
+            <w:r>
+              <w:rPr>
+                <w:sz w:val="24"/>
+              </w:rPr>
+              <w:lastRenderedPageBreak/>
+              <w:t>urodzenia, data zatrudnienia, adres, numer telefonu</w:t>
             </w:r>
           </w:p>
         </w:tc>
@@ -4302,6 +4522,7 @@
               <w:rPr>
                 <w:sz w:val="24"/>
               </w:rPr>
+              <w:lastRenderedPageBreak/>
               <w:t>numer prawa wykonywania zawodu, PESEL</w:t>
             </w:r>
           </w:p>
@@ -4323,7 +4544,6 @@
               <w:rPr>
                 <w:sz w:val="24"/>
               </w:rPr>
-              <w:lastRenderedPageBreak/>
               <w:t>4.</w:t>
             </w:r>
           </w:p>
@@ -4543,7 +4763,211 @@
               <w:rPr>
                 <w:sz w:val="24"/>
               </w:rPr>
-              <w:t>Data i godzina diagnozy + choroba + lekarz + pacjent</w:t>
+              <w:t>{</w:t>
+            </w:r>
+            <w:r>
+              <w:rPr>
+                <w:sz w:val="24"/>
+              </w:rPr>
+              <w:t>Data i godzina diagnozy</w:t>
+            </w:r>
+            <w:r>
+              <w:rPr>
+                <w:sz w:val="24"/>
+              </w:rPr>
+              <w:t>,</w:t>
+            </w:r>
+            <w:r>
+              <w:rPr>
+                <w:sz w:val="24"/>
+              </w:rPr>
+              <w:t xml:space="preserve"> choroba</w:t>
+            </w:r>
+            <w:r>
+              <w:rPr>
+                <w:sz w:val="24"/>
+              </w:rPr>
+              <w:t>,</w:t>
+            </w:r>
+            <w:r>
+              <w:rPr>
+                <w:sz w:val="24"/>
+              </w:rPr>
+              <w:t xml:space="preserve"> lekarz</w:t>
+            </w:r>
+            <w:r>
+              <w:rPr>
+                <w:sz w:val="24"/>
+              </w:rPr>
+              <w:t>,</w:t>
+            </w:r>
+            <w:r>
+              <w:rPr>
+                <w:sz w:val="24"/>
+              </w:rPr>
+              <w:t xml:space="preserve"> pacjent</w:t>
+            </w:r>
+            <w:r>
+              <w:rPr>
+                <w:sz w:val="24"/>
+              </w:rPr>
+              <w:t>}</w:t>
+            </w:r>
+          </w:p>
+        </w:tc>
+      </w:tr>
+      <w:tr>
+        <w:tc>
+          <w:tcPr>
+            <w:tcW w:w="1225" w:type="dxa"/>
+          </w:tcPr>
+          <w:p>
+            <w:pPr>
+              <w:spacing w:after="0" w:line="240" w:lineRule="auto"/>
+              <w:rPr>
+                <w:sz w:val="24"/>
+              </w:rPr>
+            </w:pPr>
+            <w:r>
+              <w:rPr>
+                <w:sz w:val="24"/>
+              </w:rPr>
+              <w:t>7.</w:t>
+            </w:r>
+          </w:p>
+        </w:tc>
+        <w:tc>
+          <w:tcPr>
+            <w:tcW w:w="1733" w:type="dxa"/>
+          </w:tcPr>
+          <w:p>
+            <w:pPr>
+              <w:spacing w:after="0" w:line="240" w:lineRule="auto"/>
+              <w:rPr>
+                <w:sz w:val="24"/>
+              </w:rPr>
+            </w:pPr>
+            <w:r>
+              <w:rPr>
+                <w:sz w:val="24"/>
+              </w:rPr>
+              <w:t>Specjalizacja</w:t>
+            </w:r>
+          </w:p>
+        </w:tc>
+        <w:tc>
+          <w:tcPr>
+            <w:tcW w:w="3920" w:type="dxa"/>
+          </w:tcPr>
+          <w:p>
+            <w:pPr>
+              <w:spacing w:after="0" w:line="240" w:lineRule="auto"/>
+              <w:rPr>
+                <w:sz w:val="24"/>
+              </w:rPr>
+            </w:pPr>
+            <w:r>
+              <w:rPr>
+                <w:sz w:val="24"/>
+              </w:rPr>
+              <w:t>Kod specjalizacji, nazwa specjalizacji</w:t>
+            </w:r>
+          </w:p>
+        </w:tc>
+        <w:tc>
+          <w:tcPr>
+            <w:tcW w:w="2800" w:type="dxa"/>
+          </w:tcPr>
+          <w:p>
+            <w:pPr>
+              <w:spacing w:after="0" w:line="240" w:lineRule="auto"/>
+              <w:rPr>
+                <w:sz w:val="24"/>
+              </w:rPr>
+            </w:pPr>
+            <w:r>
+              <w:rPr>
+                <w:sz w:val="24"/>
+              </w:rPr>
+              <w:t>Kod specjalizacji</w:t>
+            </w:r>
+          </w:p>
+        </w:tc>
+      </w:tr>
+      <w:tr>
+        <w:tc>
+          <w:tcPr>
+            <w:tcW w:w="1225" w:type="dxa"/>
+          </w:tcPr>
+          <w:p>
+            <w:pPr>
+              <w:spacing w:after="0" w:line="240" w:lineRule="auto"/>
+              <w:rPr>
+                <w:sz w:val="24"/>
+              </w:rPr>
+            </w:pPr>
+            <w:r>
+              <w:rPr>
+                <w:sz w:val="24"/>
+              </w:rPr>
+              <w:t>8.</w:t>
+            </w:r>
+          </w:p>
+        </w:tc>
+        <w:tc>
+          <w:tcPr>
+            <w:tcW w:w="1733" w:type="dxa"/>
+          </w:tcPr>
+          <w:p>
+            <w:pPr>
+              <w:spacing w:after="0" w:line="240" w:lineRule="auto"/>
+              <w:rPr>
+                <w:sz w:val="24"/>
+              </w:rPr>
+            </w:pPr>
+            <w:r>
+              <w:rPr>
+                <w:sz w:val="24"/>
+              </w:rPr>
+              <w:t>Przyjęcie</w:t>
+            </w:r>
+          </w:p>
+        </w:tc>
+        <w:tc>
+          <w:tcPr>
+            <w:tcW w:w="3920" w:type="dxa"/>
+          </w:tcPr>
+          <w:p>
+            <w:pPr>
+              <w:spacing w:after="0" w:line="240" w:lineRule="auto"/>
+              <w:rPr>
+                <w:sz w:val="24"/>
+              </w:rPr>
+            </w:pPr>
+            <w:r>
+              <w:rPr>
+                <w:sz w:val="24"/>
+              </w:rPr>
+              <w:t>Oddział, pacjent, data przyjęcia</w:t>
+            </w:r>
+          </w:p>
+        </w:tc>
+        <w:tc>
+          <w:tcPr>
+            <w:tcW w:w="2800" w:type="dxa"/>
+          </w:tcPr>
+          <w:p>
+            <w:pPr>
+              <w:spacing w:after="0" w:line="240" w:lineRule="auto"/>
+              <w:rPr>
+                <w:sz w:val="24"/>
+              </w:rPr>
+            </w:pPr>
+            <w:r>
+              <w:rPr>
+                <w:sz w:val="24"/>
+              </w:rPr>
+              <w:t>{oddział, pacjent, data przyjęcia}</w:t>
             </w:r>
           </w:p>
         </w:tc>
@@ -4598,10 +5022,10 @@
       </w:tblPr>
       <w:tblGrid>
         <w:gridCol w:w="643"/>
-        <w:gridCol w:w="1887"/>
-        <w:gridCol w:w="1390"/>
-        <w:gridCol w:w="2790"/>
-        <w:gridCol w:w="2968"/>
+        <w:gridCol w:w="2031"/>
+        <w:gridCol w:w="1369"/>
+        <w:gridCol w:w="2734"/>
+        <w:gridCol w:w="2901"/>
       </w:tblGrid>
       <w:tr>
         <w:tc>
@@ -4851,7 +5275,7 @@
               <w:rPr>
                 <w:sz w:val="24"/>
               </w:rPr>
-              <w:t>Niepuste</w:t>
+              <w:t>Wymagane</w:t>
             </w:r>
           </w:p>
         </w:tc>
@@ -4954,7 +5378,7 @@
               <w:rPr>
                 <w:sz w:val="24"/>
               </w:rPr>
-              <w:t>Niepuste</w:t>
+              <w:t>Wymagane</w:t>
             </w:r>
           </w:p>
         </w:tc>
@@ -5051,7 +5475,13 @@
               <w:rPr>
                 <w:sz w:val="24"/>
               </w:rPr>
-              <w:t>Niepuste, unikalne, 11 cyfr</w:t>
+              <w:t>Wymagane</w:t>
+            </w:r>
+            <w:r>
+              <w:rPr>
+                <w:sz w:val="24"/>
+              </w:rPr>
+              <w:t>, unikalne, 11 cyfr</w:t>
             </w:r>
           </w:p>
         </w:tc>
@@ -5087,12 +5517,26 @@
                 <w:sz w:val="24"/>
               </w:rPr>
             </w:pPr>
-            <w:r>
-              <w:rPr>
-                <w:sz w:val="24"/>
-              </w:rPr>
-              <w:t>Nazwa specjalizacji</w:t>
-            </w:r>
+            <w:proofErr w:type="spellStart"/>
+            <w:r>
+              <w:rPr>
+                <w:sz w:val="24"/>
+              </w:rPr>
+              <w:t>Nazwa</w:t>
+            </w:r>
+            <w:r>
+              <w:rPr>
+                <w:sz w:val="24"/>
+              </w:rPr>
+              <w:t>S</w:t>
+            </w:r>
+            <w:r>
+              <w:rPr>
+                <w:sz w:val="24"/>
+              </w:rPr>
+              <w:t>pecjalizacji</w:t>
+            </w:r>
+            <w:proofErr w:type="spellEnd"/>
           </w:p>
         </w:tc>
         <w:tc>
@@ -5184,12 +5628,26 @@
                 <w:sz w:val="24"/>
               </w:rPr>
             </w:pPr>
-            <w:r>
-              <w:rPr>
-                <w:sz w:val="24"/>
-              </w:rPr>
-              <w:t>Kod specjalizacji</w:t>
-            </w:r>
+            <w:proofErr w:type="spellStart"/>
+            <w:r>
+              <w:rPr>
+                <w:sz w:val="24"/>
+              </w:rPr>
+              <w:t>Kod</w:t>
+            </w:r>
+            <w:r>
+              <w:rPr>
+                <w:sz w:val="24"/>
+              </w:rPr>
+              <w:t>S</w:t>
+            </w:r>
+            <w:r>
+              <w:rPr>
+                <w:sz w:val="24"/>
+              </w:rPr>
+              <w:t>pecjalizacji</w:t>
+            </w:r>
+            <w:proofErr w:type="spellEnd"/>
           </w:p>
         </w:tc>
         <w:tc>
@@ -5285,7 +5743,7 @@
               <w:rPr>
                 <w:sz w:val="24"/>
               </w:rPr>
-              <w:t>Numer prawa wykonywania zawodu</w:t>
+              <w:t>NPWZ</w:t>
             </w:r>
           </w:p>
         </w:tc>
@@ -5323,7 +5781,13 @@
               <w:rPr>
                 <w:sz w:val="24"/>
               </w:rPr>
-              <w:t>Unikalny numer każdego lekarza dopuszczonego do wykonywania zawodu</w:t>
+              <w:t>N</w:t>
+            </w:r>
+            <w:r>
+              <w:rPr>
+                <w:sz w:val="24"/>
+              </w:rPr>
+              <w:t>umer prawa wykonywania zawodu</w:t>
             </w:r>
           </w:p>
         </w:tc>
@@ -5342,7 +5806,13 @@
               <w:rPr>
                 <w:sz w:val="24"/>
               </w:rPr>
-              <w:t>Niepuste, unikalne 7 cyfr</w:t>
+              <w:t>Wymagane</w:t>
+            </w:r>
+            <w:r>
+              <w:rPr>
+                <w:sz w:val="24"/>
+              </w:rPr>
+              <w:t>, unikalne 7 cyfr</w:t>
             </w:r>
           </w:p>
         </w:tc>
@@ -5378,12 +5848,26 @@
                 <w:sz w:val="24"/>
               </w:rPr>
             </w:pPr>
-            <w:r>
-              <w:rPr>
-                <w:sz w:val="24"/>
-              </w:rPr>
-              <w:t>Data urodzenia</w:t>
-            </w:r>
+            <w:proofErr w:type="spellStart"/>
+            <w:r>
+              <w:rPr>
+                <w:sz w:val="24"/>
+              </w:rPr>
+              <w:t>Data</w:t>
+            </w:r>
+            <w:r>
+              <w:rPr>
+                <w:sz w:val="24"/>
+              </w:rPr>
+              <w:t>U</w:t>
+            </w:r>
+            <w:r>
+              <w:rPr>
+                <w:sz w:val="24"/>
+              </w:rPr>
+              <w:t>rodzenia</w:t>
+            </w:r>
+            <w:proofErr w:type="spellEnd"/>
           </w:p>
         </w:tc>
         <w:tc>
@@ -5439,7 +5923,7 @@
               <w:rPr>
                 <w:sz w:val="24"/>
               </w:rPr>
-              <w:t>Niepuste</w:t>
+              <w:t>Wymagane</w:t>
             </w:r>
           </w:p>
         </w:tc>
@@ -5475,12 +5959,26 @@
                 <w:sz w:val="24"/>
               </w:rPr>
             </w:pPr>
-            <w:r>
-              <w:rPr>
-                <w:sz w:val="24"/>
-              </w:rPr>
-              <w:t>Data zatrudnienia</w:t>
-            </w:r>
+            <w:proofErr w:type="spellStart"/>
+            <w:r>
+              <w:rPr>
+                <w:sz w:val="24"/>
+              </w:rPr>
+              <w:t>Data</w:t>
+            </w:r>
+            <w:r>
+              <w:rPr>
+                <w:sz w:val="24"/>
+              </w:rPr>
+              <w:t>Z</w:t>
+            </w:r>
+            <w:r>
+              <w:rPr>
+                <w:sz w:val="24"/>
+              </w:rPr>
+              <w:t>atrudnienia</w:t>
+            </w:r>
+            <w:proofErr w:type="spellEnd"/>
           </w:p>
         </w:tc>
         <w:tc>
@@ -5536,7 +6034,13 @@
               <w:rPr>
                 <w:sz w:val="24"/>
               </w:rPr>
-              <w:t xml:space="preserve">Niepuste, większe od daty urodzenia </w:t>
+              <w:t>Wymagane</w:t>
+            </w:r>
+            <w:r>
+              <w:rPr>
+                <w:sz w:val="24"/>
+              </w:rPr>
+              <w:t xml:space="preserve">, większe od daty urodzenia </w:t>
             </w:r>
           </w:p>
         </w:tc>
@@ -5633,7 +6137,7 @@
               <w:rPr>
                 <w:sz w:val="24"/>
               </w:rPr>
-              <w:t>Niepuste</w:t>
+              <w:t>Wymagane</w:t>
             </w:r>
           </w:p>
         </w:tc>
@@ -5669,12 +6173,26 @@
                 <w:sz w:val="24"/>
               </w:rPr>
             </w:pPr>
-            <w:r>
-              <w:rPr>
-                <w:sz w:val="24"/>
-              </w:rPr>
-              <w:t>Numer telefonu</w:t>
-            </w:r>
+            <w:proofErr w:type="spellStart"/>
+            <w:r>
+              <w:rPr>
+                <w:sz w:val="24"/>
+              </w:rPr>
+              <w:t>Numer</w:t>
+            </w:r>
+            <w:r>
+              <w:rPr>
+                <w:sz w:val="24"/>
+              </w:rPr>
+              <w:t>T</w:t>
+            </w:r>
+            <w:r>
+              <w:rPr>
+                <w:sz w:val="24"/>
+              </w:rPr>
+              <w:t>elefonu</w:t>
+            </w:r>
+            <w:proofErr w:type="spellEnd"/>
           </w:p>
         </w:tc>
         <w:tc>
@@ -5965,7 +6483,7 @@
               <w:rPr>
                 <w:sz w:val="24"/>
               </w:rPr>
-              <w:t>Niepuste</w:t>
+              <w:t>Wymagane</w:t>
             </w:r>
           </w:p>
         </w:tc>
@@ -6062,7 +6580,7 @@
               <w:rPr>
                 <w:sz w:val="24"/>
               </w:rPr>
-              <w:t>Niepuste</w:t>
+              <w:t>Wymagane</w:t>
             </w:r>
           </w:p>
         </w:tc>
@@ -6159,7 +6677,13 @@
               <w:rPr>
                 <w:sz w:val="24"/>
               </w:rPr>
-              <w:t>Niepuste, unikalne, 11 cyfr</w:t>
+              <w:t>Wymagane</w:t>
+            </w:r>
+            <w:r>
+              <w:rPr>
+                <w:sz w:val="24"/>
+              </w:rPr>
+              <w:t>, unikalne, 11 cyfr</w:t>
             </w:r>
           </w:p>
         </w:tc>
@@ -6195,12 +6719,26 @@
                 <w:sz w:val="24"/>
               </w:rPr>
             </w:pPr>
-            <w:r>
-              <w:rPr>
-                <w:sz w:val="24"/>
-              </w:rPr>
-              <w:t>Data urodzenia</w:t>
-            </w:r>
+            <w:proofErr w:type="spellStart"/>
+            <w:r>
+              <w:rPr>
+                <w:sz w:val="24"/>
+              </w:rPr>
+              <w:t>Data</w:t>
+            </w:r>
+            <w:r>
+              <w:rPr>
+                <w:sz w:val="24"/>
+              </w:rPr>
+              <w:t>U</w:t>
+            </w:r>
+            <w:r>
+              <w:rPr>
+                <w:sz w:val="24"/>
+              </w:rPr>
+              <w:t>rodzenia</w:t>
+            </w:r>
+            <w:proofErr w:type="spellEnd"/>
           </w:p>
         </w:tc>
         <w:tc>
@@ -6256,7 +6794,7 @@
               <w:rPr>
                 <w:sz w:val="24"/>
               </w:rPr>
-              <w:t>Niepuste</w:t>
+              <w:t>Wymagane</w:t>
             </w:r>
           </w:p>
         </w:tc>
@@ -6353,7 +6891,7 @@
               <w:rPr>
                 <w:sz w:val="24"/>
               </w:rPr>
-              <w:t>Niepuste</w:t>
+              <w:t>Wymagane</w:t>
             </w:r>
           </w:p>
         </w:tc>
@@ -6389,12 +6927,26 @@
                 <w:sz w:val="24"/>
               </w:rPr>
             </w:pPr>
-            <w:r>
-              <w:rPr>
-                <w:sz w:val="24"/>
-              </w:rPr>
-              <w:t>Numer telefonu</w:t>
-            </w:r>
+            <w:proofErr w:type="spellStart"/>
+            <w:r>
+              <w:rPr>
+                <w:sz w:val="24"/>
+              </w:rPr>
+              <w:t>Numer</w:t>
+            </w:r>
+            <w:r>
+              <w:rPr>
+                <w:sz w:val="24"/>
+              </w:rPr>
+              <w:t>T</w:t>
+            </w:r>
+            <w:r>
+              <w:rPr>
+                <w:sz w:val="24"/>
+              </w:rPr>
+              <w:t>elefonu</w:t>
+            </w:r>
+            <w:proofErr w:type="spellEnd"/>
           </w:p>
         </w:tc>
         <w:tc>
@@ -6547,7 +7099,13 @@
               <w:rPr>
                 <w:sz w:val="24"/>
               </w:rPr>
-              <w:t>Niepuste, wartości: „M” lub „K”</w:t>
+              <w:t>Wymagane</w:t>
+            </w:r>
+            <w:r>
+              <w:rPr>
+                <w:sz w:val="24"/>
+              </w:rPr>
+              <w:t>, wartości: „M” lub „K”</w:t>
             </w:r>
           </w:p>
         </w:tc>
@@ -6712,6 +7270,7 @@
               <w:rPr>
                 <w:sz w:val="24"/>
               </w:rPr>
+              <w:lastRenderedPageBreak/>
               <w:t>3</w:t>
             </w:r>
             <w:r>
@@ -6794,7 +7353,7 @@
               <w:rPr>
                 <w:sz w:val="24"/>
               </w:rPr>
-              <w:t>Niepuste</w:t>
+              <w:t>Wymagane</w:t>
             </w:r>
           </w:p>
         </w:tc>
@@ -6840,7 +7399,7 @@
               <w:rPr>
                 <w:sz w:val="24"/>
               </w:rPr>
-              <w:t>kod ICD-10</w:t>
+              <w:t>ICD10</w:t>
             </w:r>
           </w:p>
         </w:tc>
@@ -6897,7 +7456,7 @@
               <w:rPr>
                 <w:sz w:val="24"/>
               </w:rPr>
-              <w:t>Niepuste</w:t>
+              <w:t>Wymagane</w:t>
             </w:r>
           </w:p>
         </w:tc>
@@ -6937,7 +7496,13 @@
               <w:rPr>
                 <w:sz w:val="24"/>
               </w:rPr>
-              <w:t>opis</w:t>
+              <w:t>O</w:t>
+            </w:r>
+            <w:r>
+              <w:rPr>
+                <w:sz w:val="24"/>
+              </w:rPr>
+              <w:t>pis</w:t>
             </w:r>
           </w:p>
         </w:tc>
@@ -7002,26 +7567,11 @@
     </w:tbl>
     <w:p>
       <w:pPr>
-        <w:pStyle w:val="Akapitzlist"/>
         <w:spacing w:after="0" w:line="240" w:lineRule="auto"/>
         <w:rPr>
           <w:sz w:val="24"/>
         </w:rPr>
       </w:pPr>
-    </w:p>
-    <w:p>
-      <w:pPr>
-        <w:spacing w:after="0" w:line="240" w:lineRule="auto"/>
-        <w:rPr>
-          <w:sz w:val="24"/>
-        </w:rPr>
-      </w:pPr>
-      <w:r>
-        <w:rPr>
-          <w:sz w:val="24"/>
-        </w:rPr>
-        <w:br w:type="page"/>
-      </w:r>
     </w:p>
     <w:p>
       <w:pPr>
@@ -7039,7 +7589,6 @@
         <w:rPr>
           <w:sz w:val="24"/>
         </w:rPr>
-        <w:lastRenderedPageBreak/>
         <w:t xml:space="preserve">Identyfikację i specyfikację </w:t>
       </w:r>
       <w:r>
@@ -7055,12 +7604,6 @@
           <w:sz w:val="24"/>
         </w:rPr>
         <w:t xml:space="preserve"> (biznesowych) i ograniczeń dziedzinowych</w:t>
-      </w:r>
-      <w:r>
-        <w:rPr>
-          <w:sz w:val="24"/>
-        </w:rPr>
-        <w:br/>
       </w:r>
     </w:p>
     <w:tbl>
@@ -7194,7 +7737,7 @@
               <w:rPr>
                 <w:sz w:val="24"/>
               </w:rPr>
-              <w:t>Każdy oddział musi należeć do jednego szpitala</w:t>
+              <w:t>Szpital posiada unikalny numer NIP</w:t>
             </w:r>
           </w:p>
         </w:tc>
@@ -7234,7 +7777,7 @@
               <w:rPr>
                 <w:sz w:val="24"/>
               </w:rPr>
-              <w:t>Każdy oddział musi mieć przypisaną nazwę i kod specjalizacji</w:t>
+              <w:t>Szpital posiada unikalny numer KRS</w:t>
             </w:r>
           </w:p>
         </w:tc>
@@ -7255,7 +7798,13 @@
               <w:rPr>
                 <w:sz w:val="24"/>
               </w:rPr>
-              <w:t>Reg/04</w:t>
+              <w:t>Reg/0</w:t>
+            </w:r>
+            <w:r>
+              <w:rPr>
+                <w:sz w:val="24"/>
+              </w:rPr>
+              <w:t>4</w:t>
             </w:r>
           </w:p>
         </w:tc>
@@ -7274,7 +7823,7 @@
               <w:rPr>
                 <w:sz w:val="24"/>
               </w:rPr>
-              <w:t>Liczba łóżek na oddziale musi być większa od 0</w:t>
+              <w:t>Szpital posiada unikalny numer Regon</w:t>
             </w:r>
           </w:p>
         </w:tc>
@@ -7314,7 +7863,7 @@
               <w:rPr>
                 <w:sz w:val="24"/>
               </w:rPr>
-              <w:t>Lekarz musi mieć unikalny numer prawa wykonywania zawodu</w:t>
+              <w:t>Numer NIP składa się z 10 cyfr</w:t>
             </w:r>
           </w:p>
         </w:tc>
@@ -7350,6 +7899,922 @@
                 <w:sz w:val="24"/>
               </w:rPr>
             </w:pPr>
+            <w:r>
+              <w:rPr>
+                <w:sz w:val="24"/>
+              </w:rPr>
+              <w:t>Numer KRS składa się z 10 cyfr</w:t>
+            </w:r>
+          </w:p>
+        </w:tc>
+      </w:tr>
+      <w:tr>
+        <w:tc>
+          <w:tcPr>
+            <w:tcW w:w="915" w:type="dxa"/>
+          </w:tcPr>
+          <w:p>
+            <w:pPr>
+              <w:spacing w:after="0" w:line="240" w:lineRule="auto"/>
+              <w:rPr>
+                <w:sz w:val="24"/>
+              </w:rPr>
+            </w:pPr>
+            <w:r>
+              <w:rPr>
+                <w:sz w:val="24"/>
+              </w:rPr>
+              <w:t>Reg/07</w:t>
+            </w:r>
+          </w:p>
+        </w:tc>
+        <w:tc>
+          <w:tcPr>
+            <w:tcW w:w="8719" w:type="dxa"/>
+          </w:tcPr>
+          <w:p>
+            <w:pPr>
+              <w:spacing w:after="0" w:line="240" w:lineRule="auto"/>
+              <w:rPr>
+                <w:sz w:val="24"/>
+              </w:rPr>
+            </w:pPr>
+            <w:r>
+              <w:rPr>
+                <w:sz w:val="24"/>
+              </w:rPr>
+              <w:t>Numer Regon składa się z 9 lub 14 cyfr</w:t>
+            </w:r>
+          </w:p>
+        </w:tc>
+      </w:tr>
+      <w:tr>
+        <w:tc>
+          <w:tcPr>
+            <w:tcW w:w="915" w:type="dxa"/>
+          </w:tcPr>
+          <w:p>
+            <w:pPr>
+              <w:spacing w:after="0" w:line="240" w:lineRule="auto"/>
+              <w:rPr>
+                <w:sz w:val="24"/>
+              </w:rPr>
+            </w:pPr>
+            <w:r>
+              <w:rPr>
+                <w:sz w:val="24"/>
+              </w:rPr>
+              <w:t>Reg/08</w:t>
+            </w:r>
+          </w:p>
+        </w:tc>
+        <w:tc>
+          <w:tcPr>
+            <w:tcW w:w="8719" w:type="dxa"/>
+          </w:tcPr>
+          <w:p>
+            <w:pPr>
+              <w:spacing w:after="0" w:line="240" w:lineRule="auto"/>
+              <w:rPr>
+                <w:sz w:val="24"/>
+              </w:rPr>
+            </w:pPr>
+            <w:r>
+              <w:rPr>
+                <w:sz w:val="24"/>
+              </w:rPr>
+              <w:t>Każdy oddział musi należeć do jednego szpitala</w:t>
+            </w:r>
+          </w:p>
+        </w:tc>
+      </w:tr>
+      <w:tr>
+        <w:tc>
+          <w:tcPr>
+            <w:tcW w:w="915" w:type="dxa"/>
+          </w:tcPr>
+          <w:p>
+            <w:pPr>
+              <w:spacing w:after="0" w:line="240" w:lineRule="auto"/>
+              <w:rPr>
+                <w:sz w:val="24"/>
+              </w:rPr>
+            </w:pPr>
+            <w:r>
+              <w:rPr>
+                <w:sz w:val="24"/>
+              </w:rPr>
+              <w:t>Reg/09</w:t>
+            </w:r>
+          </w:p>
+        </w:tc>
+        <w:tc>
+          <w:tcPr>
+            <w:tcW w:w="8719" w:type="dxa"/>
+          </w:tcPr>
+          <w:p>
+            <w:pPr>
+              <w:spacing w:after="0" w:line="240" w:lineRule="auto"/>
+              <w:rPr>
+                <w:sz w:val="24"/>
+              </w:rPr>
+            </w:pPr>
+            <w:r>
+              <w:rPr>
+                <w:sz w:val="24"/>
+              </w:rPr>
+              <w:t>Każdy oddział musi mieć przypisaną nazwę</w:t>
+            </w:r>
+          </w:p>
+        </w:tc>
+      </w:tr>
+      <w:tr>
+        <w:tc>
+          <w:tcPr>
+            <w:tcW w:w="915" w:type="dxa"/>
+          </w:tcPr>
+          <w:p>
+            <w:pPr>
+              <w:spacing w:after="0" w:line="240" w:lineRule="auto"/>
+              <w:rPr>
+                <w:sz w:val="24"/>
+              </w:rPr>
+            </w:pPr>
+            <w:r>
+              <w:rPr>
+                <w:sz w:val="24"/>
+              </w:rPr>
+              <w:t>Reg/10</w:t>
+            </w:r>
+          </w:p>
+        </w:tc>
+        <w:tc>
+          <w:tcPr>
+            <w:tcW w:w="8719" w:type="dxa"/>
+          </w:tcPr>
+          <w:p>
+            <w:pPr>
+              <w:spacing w:after="0" w:line="240" w:lineRule="auto"/>
+              <w:rPr>
+                <w:sz w:val="24"/>
+              </w:rPr>
+            </w:pPr>
+            <w:r>
+              <w:rPr>
+                <w:sz w:val="24"/>
+              </w:rPr>
+              <w:t>Każdy oddział musi mieć przypisaną specjalizacje</w:t>
+            </w:r>
+          </w:p>
+        </w:tc>
+      </w:tr>
+      <w:tr>
+        <w:tc>
+          <w:tcPr>
+            <w:tcW w:w="915" w:type="dxa"/>
+          </w:tcPr>
+          <w:p>
+            <w:pPr>
+              <w:spacing w:after="0" w:line="240" w:lineRule="auto"/>
+              <w:rPr>
+                <w:sz w:val="24"/>
+              </w:rPr>
+            </w:pPr>
+            <w:r>
+              <w:rPr>
+                <w:sz w:val="24"/>
+              </w:rPr>
+              <w:t>Reg/11</w:t>
+            </w:r>
+          </w:p>
+        </w:tc>
+        <w:tc>
+          <w:tcPr>
+            <w:tcW w:w="8719" w:type="dxa"/>
+          </w:tcPr>
+          <w:p>
+            <w:pPr>
+              <w:spacing w:after="0" w:line="240" w:lineRule="auto"/>
+              <w:rPr>
+                <w:sz w:val="24"/>
+              </w:rPr>
+            </w:pPr>
+            <w:r>
+              <w:rPr>
+                <w:sz w:val="24"/>
+              </w:rPr>
+              <w:t>Liczba łóżek na oddziale musi być większa od 0</w:t>
+            </w:r>
+          </w:p>
+        </w:tc>
+      </w:tr>
+      <w:tr>
+        <w:tc>
+          <w:tcPr>
+            <w:tcW w:w="915" w:type="dxa"/>
+          </w:tcPr>
+          <w:p>
+            <w:pPr>
+              <w:spacing w:after="0" w:line="240" w:lineRule="auto"/>
+              <w:rPr>
+                <w:sz w:val="24"/>
+              </w:rPr>
+            </w:pPr>
+            <w:r>
+              <w:rPr>
+                <w:sz w:val="24"/>
+              </w:rPr>
+              <w:t>Reg/12</w:t>
+            </w:r>
+          </w:p>
+        </w:tc>
+        <w:tc>
+          <w:tcPr>
+            <w:tcW w:w="8719" w:type="dxa"/>
+          </w:tcPr>
+          <w:p>
+            <w:pPr>
+              <w:spacing w:after="0" w:line="240" w:lineRule="auto"/>
+              <w:rPr>
+                <w:sz w:val="24"/>
+              </w:rPr>
+            </w:pPr>
+            <w:r>
+              <w:rPr>
+                <w:sz w:val="24"/>
+              </w:rPr>
+              <w:t>Lekarz musi mieć unikalny numer prawa wykonywania zawodu</w:t>
+            </w:r>
+          </w:p>
+        </w:tc>
+      </w:tr>
+      <w:tr>
+        <w:tc>
+          <w:tcPr>
+            <w:tcW w:w="915" w:type="dxa"/>
+          </w:tcPr>
+          <w:p>
+            <w:pPr>
+              <w:spacing w:after="0" w:line="240" w:lineRule="auto"/>
+              <w:rPr>
+                <w:sz w:val="24"/>
+              </w:rPr>
+            </w:pPr>
+            <w:r>
+              <w:rPr>
+                <w:sz w:val="24"/>
+              </w:rPr>
+              <w:t>Reg/13</w:t>
+            </w:r>
+          </w:p>
+        </w:tc>
+        <w:tc>
+          <w:tcPr>
+            <w:tcW w:w="8719" w:type="dxa"/>
+          </w:tcPr>
+          <w:p>
+            <w:pPr>
+              <w:spacing w:after="0" w:line="240" w:lineRule="auto"/>
+              <w:rPr>
+                <w:sz w:val="24"/>
+              </w:rPr>
+            </w:pPr>
+            <w:r>
+              <w:rPr>
+                <w:sz w:val="24"/>
+              </w:rPr>
+              <w:t>Numer prawa wykonywania zawodu składa się z 7 cyfr</w:t>
+            </w:r>
+          </w:p>
+        </w:tc>
+      </w:tr>
+      <w:tr>
+        <w:tc>
+          <w:tcPr>
+            <w:tcW w:w="915" w:type="dxa"/>
+          </w:tcPr>
+          <w:p>
+            <w:pPr>
+              <w:spacing w:after="0" w:line="240" w:lineRule="auto"/>
+              <w:rPr>
+                <w:sz w:val="24"/>
+              </w:rPr>
+            </w:pPr>
+            <w:r>
+              <w:rPr>
+                <w:sz w:val="24"/>
+              </w:rPr>
+              <w:t>Reg/14</w:t>
+            </w:r>
+          </w:p>
+        </w:tc>
+        <w:tc>
+          <w:tcPr>
+            <w:tcW w:w="8719" w:type="dxa"/>
+          </w:tcPr>
+          <w:p>
+            <w:pPr>
+              <w:spacing w:after="0" w:line="240" w:lineRule="auto"/>
+              <w:rPr>
+                <w:sz w:val="24"/>
+              </w:rPr>
+            </w:pPr>
+            <w:r>
+              <w:rPr>
+                <w:sz w:val="24"/>
+              </w:rPr>
+              <w:t xml:space="preserve">Identyfikator PESEL </w:t>
+            </w:r>
+            <w:r>
+              <w:rPr>
+                <w:sz w:val="24"/>
+              </w:rPr>
+              <w:t xml:space="preserve">lekarza i pacjenta musi </w:t>
+            </w:r>
+            <w:r>
+              <w:rPr>
+                <w:sz w:val="24"/>
+              </w:rPr>
+              <w:t>składać się z dokładnie 11 cyfr</w:t>
+            </w:r>
+          </w:p>
+        </w:tc>
+      </w:tr>
+      <w:tr>
+        <w:tc>
+          <w:tcPr>
+            <w:tcW w:w="915" w:type="dxa"/>
+          </w:tcPr>
+          <w:p>
+            <w:pPr>
+              <w:spacing w:after="0" w:line="240" w:lineRule="auto"/>
+              <w:rPr>
+                <w:sz w:val="24"/>
+              </w:rPr>
+            </w:pPr>
+            <w:r>
+              <w:rPr>
+                <w:sz w:val="24"/>
+              </w:rPr>
+              <w:t>Reg/15</w:t>
+            </w:r>
+          </w:p>
+        </w:tc>
+        <w:tc>
+          <w:tcPr>
+            <w:tcW w:w="8719" w:type="dxa"/>
+          </w:tcPr>
+          <w:p>
+            <w:pPr>
+              <w:spacing w:after="0" w:line="240" w:lineRule="auto"/>
+              <w:rPr>
+                <w:sz w:val="24"/>
+              </w:rPr>
+            </w:pPr>
+            <w:r>
+              <w:rPr>
+                <w:sz w:val="24"/>
+              </w:rPr>
+              <w:t>Identyfikator</w:t>
+            </w:r>
+            <w:r>
+              <w:rPr>
+                <w:sz w:val="24"/>
+              </w:rPr>
+              <w:t>y</w:t>
+            </w:r>
+            <w:r>
+              <w:rPr>
+                <w:sz w:val="24"/>
+              </w:rPr>
+              <w:t xml:space="preserve"> PESEL</w:t>
+            </w:r>
+            <w:r>
+              <w:rPr>
+                <w:sz w:val="24"/>
+              </w:rPr>
+              <w:t xml:space="preserve"> lekarza i pacjenta są unikalne</w:t>
+            </w:r>
+          </w:p>
+        </w:tc>
+      </w:tr>
+      <w:tr>
+        <w:tc>
+          <w:tcPr>
+            <w:tcW w:w="915" w:type="dxa"/>
+          </w:tcPr>
+          <w:p>
+            <w:pPr>
+              <w:spacing w:after="0" w:line="240" w:lineRule="auto"/>
+              <w:rPr>
+                <w:sz w:val="24"/>
+              </w:rPr>
+            </w:pPr>
+            <w:r>
+              <w:rPr>
+                <w:sz w:val="24"/>
+              </w:rPr>
+              <w:t>Reg/16</w:t>
+            </w:r>
+          </w:p>
+        </w:tc>
+        <w:tc>
+          <w:tcPr>
+            <w:tcW w:w="8719" w:type="dxa"/>
+          </w:tcPr>
+          <w:p>
+            <w:pPr>
+              <w:spacing w:after="0" w:line="240" w:lineRule="auto"/>
+              <w:rPr>
+                <w:sz w:val="24"/>
+              </w:rPr>
+            </w:pPr>
+            <w:r>
+              <w:rPr>
+                <w:sz w:val="24"/>
+              </w:rPr>
+              <w:t>Data zatrudnienia lekarza musi być chronologicznie późniejsza niż jego data urodzenia.</w:t>
+            </w:r>
+          </w:p>
+        </w:tc>
+      </w:tr>
+      <w:tr>
+        <w:tc>
+          <w:tcPr>
+            <w:tcW w:w="915" w:type="dxa"/>
+          </w:tcPr>
+          <w:p>
+            <w:pPr>
+              <w:spacing w:after="0" w:line="240" w:lineRule="auto"/>
+              <w:rPr>
+                <w:sz w:val="24"/>
+              </w:rPr>
+            </w:pPr>
+            <w:r>
+              <w:rPr>
+                <w:sz w:val="24"/>
+              </w:rPr>
+              <w:t>Reg/17</w:t>
+            </w:r>
+          </w:p>
+        </w:tc>
+        <w:tc>
+          <w:tcPr>
+            <w:tcW w:w="8719" w:type="dxa"/>
+          </w:tcPr>
+          <w:p>
+            <w:pPr>
+              <w:spacing w:after="0" w:line="240" w:lineRule="auto"/>
+              <w:rPr>
+                <w:sz w:val="24"/>
+              </w:rPr>
+            </w:pPr>
+            <w:r>
+              <w:rPr>
+                <w:sz w:val="24"/>
+              </w:rPr>
+              <w:t>Płeć pacjenta może przyjmować wartości „M” (mężczyzna) lub „K” (kobieta)</w:t>
+            </w:r>
+          </w:p>
+        </w:tc>
+      </w:tr>
+      <w:tr>
+        <w:tc>
+          <w:tcPr>
+            <w:tcW w:w="915" w:type="dxa"/>
+          </w:tcPr>
+          <w:p>
+            <w:pPr>
+              <w:spacing w:after="0" w:line="240" w:lineRule="auto"/>
+              <w:rPr>
+                <w:sz w:val="24"/>
+              </w:rPr>
+            </w:pPr>
+            <w:r>
+              <w:rPr>
+                <w:sz w:val="24"/>
+              </w:rPr>
+              <w:t>Reg/18</w:t>
+            </w:r>
+          </w:p>
+        </w:tc>
+        <w:tc>
+          <w:tcPr>
+            <w:tcW w:w="8719" w:type="dxa"/>
+          </w:tcPr>
+          <w:p>
+            <w:pPr>
+              <w:spacing w:after="0" w:line="240" w:lineRule="auto"/>
+              <w:rPr>
+                <w:sz w:val="24"/>
+              </w:rPr>
+            </w:pPr>
+            <w:r>
+              <w:rPr>
+                <w:sz w:val="24"/>
+              </w:rPr>
+              <w:t>Diagnoza musi być wystawiona przez lekarza</w:t>
+            </w:r>
+          </w:p>
+        </w:tc>
+      </w:tr>
+      <w:tr>
+        <w:tc>
+          <w:tcPr>
+            <w:tcW w:w="915" w:type="dxa"/>
+          </w:tcPr>
+          <w:p>
+            <w:pPr>
+              <w:spacing w:after="0" w:line="240" w:lineRule="auto"/>
+              <w:rPr>
+                <w:sz w:val="24"/>
+              </w:rPr>
+            </w:pPr>
+            <w:r>
+              <w:rPr>
+                <w:sz w:val="24"/>
+              </w:rPr>
+              <w:t>Reg/19</w:t>
+            </w:r>
+          </w:p>
+        </w:tc>
+        <w:tc>
+          <w:tcPr>
+            <w:tcW w:w="8719" w:type="dxa"/>
+          </w:tcPr>
+          <w:p>
+            <w:pPr>
+              <w:spacing w:after="0" w:line="240" w:lineRule="auto"/>
+              <w:rPr>
+                <w:sz w:val="24"/>
+              </w:rPr>
+            </w:pPr>
+            <w:r>
+              <w:rPr>
+                <w:sz w:val="24"/>
+              </w:rPr>
+              <w:t>Diagnoza musi dotyczyć jednego pacjenta</w:t>
+            </w:r>
+          </w:p>
+        </w:tc>
+      </w:tr>
+      <w:tr>
+        <w:tc>
+          <w:tcPr>
+            <w:tcW w:w="915" w:type="dxa"/>
+          </w:tcPr>
+          <w:p>
+            <w:pPr>
+              <w:spacing w:after="0" w:line="240" w:lineRule="auto"/>
+              <w:rPr>
+                <w:sz w:val="24"/>
+              </w:rPr>
+            </w:pPr>
+            <w:r>
+              <w:rPr>
+                <w:sz w:val="24"/>
+              </w:rPr>
+              <w:t>Reg/20</w:t>
+            </w:r>
+          </w:p>
+        </w:tc>
+        <w:tc>
+          <w:tcPr>
+            <w:tcW w:w="8719" w:type="dxa"/>
+          </w:tcPr>
+          <w:p>
+            <w:pPr>
+              <w:spacing w:after="0" w:line="240" w:lineRule="auto"/>
+              <w:rPr>
+                <w:sz w:val="24"/>
+              </w:rPr>
+            </w:pPr>
+            <w:r>
+              <w:rPr>
+                <w:sz w:val="24"/>
+              </w:rPr>
+              <w:t>Diagnoza może dotyczyć tylko jednej choroby</w:t>
+            </w:r>
+          </w:p>
+        </w:tc>
+      </w:tr>
+      <w:tr>
+        <w:tc>
+          <w:tcPr>
+            <w:tcW w:w="915" w:type="dxa"/>
+          </w:tcPr>
+          <w:p>
+            <w:pPr>
+              <w:spacing w:after="0" w:line="240" w:lineRule="auto"/>
+              <w:rPr>
+                <w:sz w:val="24"/>
+              </w:rPr>
+            </w:pPr>
+            <w:r>
+              <w:rPr>
+                <w:sz w:val="24"/>
+              </w:rPr>
+              <w:t>Reg/21</w:t>
+            </w:r>
+          </w:p>
+        </w:tc>
+        <w:tc>
+          <w:tcPr>
+            <w:tcW w:w="8719" w:type="dxa"/>
+          </w:tcPr>
+          <w:p>
+            <w:pPr>
+              <w:spacing w:after="0" w:line="240" w:lineRule="auto"/>
+              <w:rPr>
+                <w:sz w:val="24"/>
+              </w:rPr>
+            </w:pPr>
+            <w:r>
+              <w:rPr>
+                <w:sz w:val="24"/>
+              </w:rPr>
+              <w:t>Kod specjalizacji jest maksymalnie 3 cyfrowy</w:t>
+            </w:r>
+          </w:p>
+        </w:tc>
+      </w:tr>
+      <w:tr>
+        <w:tc>
+          <w:tcPr>
+            <w:tcW w:w="915" w:type="dxa"/>
+          </w:tcPr>
+          <w:p>
+            <w:pPr>
+              <w:spacing w:after="0" w:line="240" w:lineRule="auto"/>
+              <w:rPr>
+                <w:sz w:val="24"/>
+              </w:rPr>
+            </w:pPr>
+            <w:r>
+              <w:rPr>
+                <w:sz w:val="24"/>
+              </w:rPr>
+              <w:t>Reg/22</w:t>
+            </w:r>
+          </w:p>
+        </w:tc>
+        <w:tc>
+          <w:tcPr>
+            <w:tcW w:w="8719" w:type="dxa"/>
+          </w:tcPr>
+          <w:p>
+            <w:pPr>
+              <w:spacing w:after="0" w:line="240" w:lineRule="auto"/>
+              <w:rPr>
+                <w:sz w:val="24"/>
+              </w:rPr>
+            </w:pPr>
+            <w:r>
+              <w:rPr>
+                <w:sz w:val="24"/>
+              </w:rPr>
+              <w:t>Pacjent może być przypisany wielokrotnie do wielu oddziałów leczenia (w tym do tego samego)</w:t>
+            </w:r>
+          </w:p>
+        </w:tc>
+      </w:tr>
+      <w:tr>
+        <w:tc>
+          <w:tcPr>
+            <w:tcW w:w="915" w:type="dxa"/>
+          </w:tcPr>
+          <w:p>
+            <w:pPr>
+              <w:spacing w:after="0" w:line="240" w:lineRule="auto"/>
+              <w:rPr>
+                <w:sz w:val="24"/>
+              </w:rPr>
+            </w:pPr>
+            <w:r>
+              <w:rPr>
+                <w:sz w:val="24"/>
+              </w:rPr>
+              <w:t>Reg/23</w:t>
+            </w:r>
+          </w:p>
+        </w:tc>
+        <w:tc>
+          <w:tcPr>
+            <w:tcW w:w="8719" w:type="dxa"/>
+          </w:tcPr>
+          <w:p>
+            <w:pPr>
+              <w:spacing w:after="0" w:line="240" w:lineRule="auto"/>
+              <w:rPr>
+                <w:sz w:val="24"/>
+              </w:rPr>
+            </w:pPr>
+            <w:r>
+              <w:rPr>
+                <w:sz w:val="24"/>
+              </w:rPr>
+              <w:t>Data urodzenia nie może być większa niż obecna data</w:t>
+            </w:r>
+          </w:p>
+        </w:tc>
+      </w:tr>
+      <w:tr>
+        <w:tc>
+          <w:tcPr>
+            <w:tcW w:w="915" w:type="dxa"/>
+          </w:tcPr>
+          <w:p>
+            <w:pPr>
+              <w:spacing w:after="0" w:line="240" w:lineRule="auto"/>
+              <w:rPr>
+                <w:sz w:val="24"/>
+              </w:rPr>
+            </w:pPr>
+            <w:r>
+              <w:rPr>
+                <w:sz w:val="24"/>
+              </w:rPr>
+              <w:t>Reg/24</w:t>
+            </w:r>
+          </w:p>
+        </w:tc>
+        <w:tc>
+          <w:tcPr>
+            <w:tcW w:w="8719" w:type="dxa"/>
+          </w:tcPr>
+          <w:p>
+            <w:pPr>
+              <w:spacing w:after="0" w:line="240" w:lineRule="auto"/>
+              <w:rPr>
+                <w:sz w:val="24"/>
+              </w:rPr>
+            </w:pPr>
+            <w:r>
+              <w:rPr>
+                <w:sz w:val="24"/>
+              </w:rPr>
+              <w:t>Data zatrudnienia nie może być większa niż obecna data</w:t>
+            </w:r>
+          </w:p>
+        </w:tc>
+      </w:tr>
+      <w:tr>
+        <w:tc>
+          <w:tcPr>
+            <w:tcW w:w="915" w:type="dxa"/>
+          </w:tcPr>
+          <w:p>
+            <w:pPr>
+              <w:spacing w:after="0" w:line="240" w:lineRule="auto"/>
+              <w:rPr>
+                <w:sz w:val="24"/>
+              </w:rPr>
+            </w:pPr>
+            <w:r>
+              <w:rPr>
+                <w:sz w:val="24"/>
+              </w:rPr>
+              <w:t>Reg/25</w:t>
+            </w:r>
+          </w:p>
+        </w:tc>
+        <w:tc>
+          <w:tcPr>
+            <w:tcW w:w="8719" w:type="dxa"/>
+          </w:tcPr>
+          <w:p>
+            <w:pPr>
+              <w:spacing w:after="0" w:line="240" w:lineRule="auto"/>
+              <w:rPr>
+                <w:sz w:val="24"/>
+              </w:rPr>
+            </w:pPr>
+            <w:r>
+              <w:rPr>
+                <w:sz w:val="24"/>
+              </w:rPr>
+              <w:t>Data i godzina wystawienia diagnozy nie mogą być większe niż obecna data i godzina</w:t>
+            </w:r>
+          </w:p>
+        </w:tc>
+      </w:tr>
+      <w:tr>
+        <w:tc>
+          <w:tcPr>
+            <w:tcW w:w="915" w:type="dxa"/>
+          </w:tcPr>
+          <w:p>
+            <w:pPr>
+              <w:spacing w:after="0" w:line="240" w:lineRule="auto"/>
+              <w:rPr>
+                <w:sz w:val="24"/>
+              </w:rPr>
+            </w:pPr>
+            <w:r>
+              <w:rPr>
+                <w:sz w:val="24"/>
+              </w:rPr>
+              <w:t>Reg/26</w:t>
+            </w:r>
+          </w:p>
+        </w:tc>
+        <w:tc>
+          <w:tcPr>
+            <w:tcW w:w="8719" w:type="dxa"/>
+          </w:tcPr>
+          <w:p>
+            <w:pPr>
+              <w:spacing w:after="0" w:line="240" w:lineRule="auto"/>
+              <w:rPr>
+                <w:sz w:val="24"/>
+              </w:rPr>
+            </w:pPr>
+            <w:r>
+              <w:rPr>
+                <w:sz w:val="24"/>
+              </w:rPr>
+              <w:t>Data i godzina wystawienia diagnozy musi być większa niż data zatrudnienia lekarza</w:t>
+            </w:r>
+          </w:p>
+        </w:tc>
+      </w:tr>
+      <w:tr>
+        <w:tc>
+          <w:tcPr>
+            <w:tcW w:w="915" w:type="dxa"/>
+          </w:tcPr>
+          <w:p>
+            <w:pPr>
+              <w:spacing w:after="0" w:line="240" w:lineRule="auto"/>
+              <w:rPr>
+                <w:sz w:val="24"/>
+              </w:rPr>
+            </w:pPr>
+            <w:r>
+              <w:rPr>
+                <w:sz w:val="24"/>
+              </w:rPr>
+              <w:t>Reg/27</w:t>
+            </w:r>
+          </w:p>
+        </w:tc>
+        <w:tc>
+          <w:tcPr>
+            <w:tcW w:w="8719" w:type="dxa"/>
+          </w:tcPr>
+          <w:p>
+            <w:pPr>
+              <w:spacing w:after="0" w:line="240" w:lineRule="auto"/>
+              <w:rPr>
+                <w:sz w:val="24"/>
+              </w:rPr>
+            </w:pPr>
+            <w:r>
+              <w:rPr>
+                <w:sz w:val="24"/>
+              </w:rPr>
+              <w:t>Każda choroba musi mieć unikalny kod ICD-10</w:t>
+            </w:r>
+          </w:p>
+        </w:tc>
+      </w:tr>
+      <w:tr>
+        <w:tc>
+          <w:tcPr>
+            <w:tcW w:w="915" w:type="dxa"/>
+          </w:tcPr>
+          <w:p>
+            <w:pPr>
+              <w:spacing w:after="0" w:line="240" w:lineRule="auto"/>
+              <w:rPr>
+                <w:sz w:val="24"/>
+              </w:rPr>
+            </w:pPr>
+            <w:r>
+              <w:rPr>
+                <w:sz w:val="24"/>
+              </w:rPr>
+              <w:t>Reg/28</w:t>
+            </w:r>
+          </w:p>
+        </w:tc>
+        <w:tc>
+          <w:tcPr>
+            <w:tcW w:w="8719" w:type="dxa"/>
+          </w:tcPr>
+          <w:p>
+            <w:pPr>
+              <w:spacing w:after="0" w:line="240" w:lineRule="auto"/>
+              <w:rPr>
+                <w:sz w:val="24"/>
+              </w:rPr>
+            </w:pPr>
+            <w:r>
+              <w:rPr>
+                <w:sz w:val="24"/>
+              </w:rPr>
+              <w:t>Data przyjęcia na oddział nie może być większa od obecnej daty</w:t>
+            </w:r>
           </w:p>
         </w:tc>
       </w:tr>
@@ -7377,9 +8842,90 @@
       </w:pPr>
       <w:r>
         <w:rPr>
-          <w:sz w:val="24"/>
-        </w:rPr>
-        <w:t>A</w:t>
+          <w:b/>
+          <w:bCs/>
+          <w:sz w:val="24"/>
+        </w:rPr>
+        <w:t>Model konceptualny danych</w:t>
+      </w:r>
+      <w:r>
+        <w:rPr>
+          <w:sz w:val="24"/>
+        </w:rPr>
+        <w:t xml:space="preserve"> (diagram klas UML) oraz jego weryfikacja względem reguł biznesowych</w:t>
+      </w:r>
+      <w:r>
+        <w:rPr>
+          <w:sz w:val="24"/>
+        </w:rPr>
+        <w:br/>
+      </w:r>
+      <w:r>
+        <w:rPr>
+          <w:noProof/>
+        </w:rPr>
+        <w:lastRenderedPageBreak/>
+        <w:drawing>
+          <wp:inline distT="0" distB="0" distL="0" distR="0" wp14:anchorId="595D9DAE" wp14:editId="699B153C">
+            <wp:extent cx="6151880" cy="7992110"/>
+            <wp:effectExtent l="0" t="0" r="1270" b="8890"/>
+            <wp:docPr id="171734366" name="Obraz 2"/>
+            <wp:cNvGraphicFramePr>
+              <a:graphicFrameLocks xmlns:a="http://schemas.openxmlformats.org/drawingml/2006/main" noChangeAspect="1"/>
+            </wp:cNvGraphicFramePr>
+            <a:graphic xmlns:a="http://schemas.openxmlformats.org/drawingml/2006/main">
+              <a:graphicData uri="http://schemas.openxmlformats.org/drawingml/2006/picture">
+                <pic:pic xmlns:pic="http://schemas.openxmlformats.org/drawingml/2006/picture">
+                  <pic:nvPicPr>
+                    <pic:cNvPr id="0" name="Picture 3"/>
+                    <pic:cNvPicPr>
+                      <a:picLocks noChangeAspect="1" noChangeArrowheads="1"/>
+                    </pic:cNvPicPr>
+                  </pic:nvPicPr>
+                  <pic:blipFill>
+                    <a:blip r:embed="rId9">
+                      <a:extLst>
+                        <a:ext uri="{28A0092B-C50C-407E-A947-70E740481C1C}">
+                          <a14:useLocalDpi xmlns:a14="http://schemas.microsoft.com/office/drawing/2010/main" val="0"/>
+                        </a:ext>
+                      </a:extLst>
+                    </a:blip>
+                    <a:srcRect/>
+                    <a:stretch>
+                      <a:fillRect/>
+                    </a:stretch>
+                  </pic:blipFill>
+                  <pic:spPr bwMode="auto">
+                    <a:xfrm>
+                      <a:off x="0" y="0"/>
+                      <a:ext cx="6151880" cy="7992110"/>
+                    </a:xfrm>
+                    <a:prstGeom prst="rect">
+                      <a:avLst/>
+                    </a:prstGeom>
+                    <a:noFill/>
+                    <a:ln>
+                      <a:noFill/>
+                    </a:ln>
+                  </pic:spPr>
+                </pic:pic>
+              </a:graphicData>
+            </a:graphic>
+          </wp:inline>
+        </w:drawing>
+      </w:r>
+      <w:r>
+        <w:rPr>
+          <w:sz w:val="24"/>
+        </w:rPr>
+        <w:br/>
+        <w:t>Model jest zgodny z regułami biznesowymi.</w:t>
+      </w:r>
+      <w:r>
+        <w:rPr>
+          <w:sz w:val="24"/>
+        </w:rPr>
+        <w:br/>
       </w:r>
     </w:p>
     <w:p>
@@ -7413,7 +8959,7 @@
           <w:sz w:val="24"/>
         </w:rPr>
       </w:pPr>
-      <w:hyperlink r:id="rId9" w:history="1">
+      <w:hyperlink r:id="rId10" w:history="1">
         <w:r>
           <w:rPr>
             <w:rStyle w:val="Hipercze"/>
@@ -7435,7 +8981,7 @@
           <w:sz w:val="24"/>
         </w:rPr>
       </w:pPr>
-      <w:hyperlink r:id="rId10" w:history="1">
+      <w:hyperlink r:id="rId11" w:history="1">
         <w:r>
           <w:rPr>
             <w:rStyle w:val="Hipercze"/>
@@ -7457,7 +9003,7 @@
           <w:sz w:val="24"/>
         </w:rPr>
       </w:pPr>
-      <w:hyperlink r:id="rId11" w:history="1">
+      <w:hyperlink r:id="rId12" w:history="1">
         <w:r>
           <w:rPr>
             <w:rStyle w:val="Hipercze"/>
@@ -7479,6 +9025,21 @@
           <w:sz w:val="24"/>
         </w:rPr>
       </w:pPr>
+      <w:hyperlink r:id="rId13" w:history="1">
+        <w:r>
+          <w:rPr>
+            <w:rStyle w:val="Hipercze"/>
+            <w:sz w:val="24"/>
+          </w:rPr>
+          <w:t>https://pl.wikipedia.org/wiki/REGON</w:t>
+        </w:r>
+      </w:hyperlink>
+      <w:r>
+        <w:rPr>
+          <w:sz w:val="24"/>
+        </w:rPr>
+        <w:t xml:space="preserve"> </w:t>
+      </w:r>
       <w:r>
         <w:rPr>
           <w:sz w:val="24"/>
@@ -7847,8 +9408,9 @@
           <w:szCs w:val="24"/>
           <w:lang w:val="en-US"/>
         </w:rPr>
-        <w:t>Baza danych: AdventureWorks -</w:t>
-      </w:r>
+        <w:t xml:space="preserve">Baza </w:t>
+      </w:r>
+      <w:proofErr w:type="spellStart"/>
       <w:r>
         <w:rPr>
           <w:rFonts w:cs="TimesNewRomanPSMT"/>
@@ -7856,8 +9418,38 @@
           <w:szCs w:val="24"/>
           <w:lang w:val="en-US"/>
         </w:rPr>
-        <w:t xml:space="preserve"> SalesOrderHeader</w:t>
-      </w:r>
+        <w:t>danych</w:t>
+      </w:r>
+      <w:proofErr w:type="spellEnd"/>
+      <w:r>
+        <w:rPr>
+          <w:rFonts w:cs="TimesNewRomanPSMT"/>
+          <w:sz w:val="24"/>
+          <w:szCs w:val="24"/>
+          <w:lang w:val="en-US"/>
+        </w:rPr>
+        <w:t>: AdventureWorks -</w:t>
+      </w:r>
+      <w:r>
+        <w:rPr>
+          <w:rFonts w:cs="TimesNewRomanPSMT"/>
+          <w:sz w:val="24"/>
+          <w:szCs w:val="24"/>
+          <w:lang w:val="en-US"/>
+        </w:rPr>
+        <w:t xml:space="preserve"> </w:t>
+      </w:r>
+      <w:proofErr w:type="spellStart"/>
+      <w:r>
+        <w:rPr>
+          <w:rFonts w:cs="TimesNewRomanPSMT"/>
+          <w:sz w:val="24"/>
+          <w:szCs w:val="24"/>
+          <w:lang w:val="en-US"/>
+        </w:rPr>
+        <w:t>SalesOrderHeader</w:t>
+      </w:r>
+      <w:proofErr w:type="spellEnd"/>
       <w:r>
         <w:rPr>
           <w:rFonts w:cs="TimesNewRomanPSMT"/>
@@ -7936,7 +9528,6 @@
           <w:sz w:val="20"/>
           <w:szCs w:val="20"/>
         </w:rPr>
-        <w:lastRenderedPageBreak/>
         <w:t xml:space="preserve">Tabela 5. </w:t>
       </w:r>
       <w:r>
@@ -8382,11 +9973,19 @@
           <w:sz w:val="24"/>
         </w:rPr>
       </w:pPr>
-      <w:r>
-        <w:rPr>
-          <w:sz w:val="24"/>
-        </w:rPr>
-        <w:t>Rek.: 4/?</w:t>
+      <w:proofErr w:type="spellStart"/>
+      <w:r>
+        <w:rPr>
+          <w:sz w:val="24"/>
+        </w:rPr>
+        <w:t>Rek</w:t>
+      </w:r>
+      <w:proofErr w:type="spellEnd"/>
+      <w:r>
+        <w:rPr>
+          <w:sz w:val="24"/>
+        </w:rPr>
+        <w:t>.: 4/?</w:t>
       </w:r>
     </w:p>
     <w:p>
@@ -8543,6 +10142,7 @@
           <w:sz w:val="24"/>
           <w:szCs w:val="24"/>
         </w:rPr>
+        <w:lastRenderedPageBreak/>
         <w:t xml:space="preserve">mniejszą niż 10 </w:t>
       </w:r>
     </w:p>
@@ -8859,11 +10459,19 @@
           <w:sz w:val="24"/>
         </w:rPr>
       </w:pPr>
-      <w:r>
-        <w:rPr>
-          <w:sz w:val="24"/>
-        </w:rPr>
-        <w:t>Rek.: 3/</w:t>
+      <w:proofErr w:type="spellStart"/>
+      <w:r>
+        <w:rPr>
+          <w:sz w:val="24"/>
+        </w:rPr>
+        <w:t>Rek</w:t>
+      </w:r>
+      <w:proofErr w:type="spellEnd"/>
+      <w:r>
+        <w:rPr>
+          <w:sz w:val="24"/>
+        </w:rPr>
+        <w:t>.: 3/</w:t>
       </w:r>
       <w:r>
         <w:rPr>
@@ -9077,11 +10685,19 @@
           <w:sz w:val="24"/>
         </w:rPr>
       </w:pPr>
-      <w:r>
-        <w:rPr>
-          <w:sz w:val="24"/>
-        </w:rPr>
-        <w:t>Rek.: 1</w:t>
+      <w:proofErr w:type="spellStart"/>
+      <w:r>
+        <w:rPr>
+          <w:sz w:val="24"/>
+        </w:rPr>
+        <w:t>Rek</w:t>
+      </w:r>
+      <w:proofErr w:type="spellEnd"/>
+      <w:r>
+        <w:rPr>
+          <w:sz w:val="24"/>
+        </w:rPr>
+        <w:t>.: 1</w:t>
       </w:r>
     </w:p>
     <w:p>
@@ -9286,23 +10902,43 @@
           <w:sz w:val="24"/>
           <w:szCs w:val="24"/>
         </w:rPr>
-        <w:t>Źródło danych: SalesOrderHeader</w:t>
-      </w:r>
+        <w:t xml:space="preserve">Źródło danych: </w:t>
+      </w:r>
+      <w:proofErr w:type="spellStart"/>
       <w:r>
         <w:rPr>
           <w:rFonts w:cs="TimesNewRomanPSMT"/>
           <w:sz w:val="24"/>
           <w:szCs w:val="24"/>
         </w:rPr>
+        <w:t>SalesOrderHeader</w:t>
+      </w:r>
+      <w:proofErr w:type="spellEnd"/>
+      <w:r>
+        <w:rPr>
+          <w:rFonts w:cs="TimesNewRomanPSMT"/>
+          <w:sz w:val="24"/>
+          <w:szCs w:val="24"/>
+        </w:rPr>
         <w:t xml:space="preserve">, </w:t>
       </w:r>
+      <w:proofErr w:type="spellStart"/>
       <w:r>
         <w:rPr>
           <w:rFonts w:cs="TimesNewRomanPSMT"/>
           <w:sz w:val="24"/>
           <w:szCs w:val="24"/>
         </w:rPr>
-        <w:t xml:space="preserve">SalesReason, </w:t>
+        <w:t>SalesReason</w:t>
+      </w:r>
+      <w:proofErr w:type="spellEnd"/>
+      <w:r>
+        <w:rPr>
+          <w:rFonts w:cs="TimesNewRomanPSMT"/>
+          <w:sz w:val="24"/>
+          <w:szCs w:val="24"/>
+        </w:rPr>
+        <w:t xml:space="preserve">, </w:t>
       </w:r>
       <w:r>
         <w:rPr>
@@ -9353,7 +10989,6 @@
           <w:sz w:val="20"/>
           <w:szCs w:val="20"/>
         </w:rPr>
-        <w:lastRenderedPageBreak/>
         <w:t xml:space="preserve">Tabela 2.3. </w:t>
       </w:r>
       <w:r>
@@ -9450,6 +11085,7 @@
                 <w:szCs w:val="24"/>
               </w:rPr>
             </w:pPr>
+            <w:proofErr w:type="spellStart"/>
             <w:r>
               <w:rPr>
                 <w:rFonts w:cs="TimesNewRomanPSMT"/>
@@ -9458,6 +11094,7 @@
               </w:rPr>
               <w:t>Price</w:t>
             </w:r>
+            <w:proofErr w:type="spellEnd"/>
           </w:p>
         </w:tc>
         <w:tc>
@@ -9512,8 +11149,18 @@
                 <w:sz w:val="24"/>
                 <w:szCs w:val="24"/>
               </w:rPr>
-              <w:t>On Promotion</w:t>
-            </w:r>
+              <w:t xml:space="preserve">On </w:t>
+            </w:r>
+            <w:proofErr w:type="spellStart"/>
+            <w:r>
+              <w:rPr>
+                <w:rFonts w:cs="TimesNewRomanPSMT"/>
+                <w:sz w:val="24"/>
+                <w:szCs w:val="24"/>
+              </w:rPr>
+              <w:t>Promotion</w:t>
+            </w:r>
+            <w:proofErr w:type="spellEnd"/>
           </w:p>
         </w:tc>
         <w:tc>
@@ -9562,6 +11209,7 @@
                 <w:szCs w:val="24"/>
               </w:rPr>
             </w:pPr>
+            <w:proofErr w:type="spellStart"/>
             <w:r>
               <w:rPr>
                 <w:rFonts w:cs="TimesNewRomanPSMT"/>
@@ -9570,6 +11218,7 @@
               </w:rPr>
               <w:t>Manufacturer</w:t>
             </w:r>
+            <w:proofErr w:type="spellEnd"/>
           </w:p>
         </w:tc>
         <w:tc>
@@ -9664,11 +11313,19 @@
           <w:sz w:val="24"/>
         </w:rPr>
       </w:pPr>
-      <w:r>
-        <w:rPr>
-          <w:sz w:val="24"/>
-        </w:rPr>
-        <w:t>Rek.: 3/?</w:t>
+      <w:proofErr w:type="spellStart"/>
+      <w:r>
+        <w:rPr>
+          <w:sz w:val="24"/>
+        </w:rPr>
+        <w:t>Rek</w:t>
+      </w:r>
+      <w:proofErr w:type="spellEnd"/>
+      <w:r>
+        <w:rPr>
+          <w:sz w:val="24"/>
+        </w:rPr>
+        <w:t>.: 3/?</w:t>
       </w:r>
     </w:p>
     <w:p>
@@ -9815,7 +11472,43 @@
           <w:szCs w:val="24"/>
         </w:rPr>
         <w:br/>
-        <w:t>Do wygenerowania pierwszej części zadania użyłem Gemini oraz ChatGPT, oba modele n</w:t>
+        <w:t xml:space="preserve">Do wygenerowania pierwszej części zadania użyłem </w:t>
+      </w:r>
+      <w:proofErr w:type="spellStart"/>
+      <w:r>
+        <w:rPr>
+          <w:b/>
+          <w:sz w:val="24"/>
+          <w:szCs w:val="24"/>
+        </w:rPr>
+        <w:t>Gemini</w:t>
+      </w:r>
+      <w:proofErr w:type="spellEnd"/>
+      <w:r>
+        <w:rPr>
+          <w:b/>
+          <w:sz w:val="24"/>
+          <w:szCs w:val="24"/>
+        </w:rPr>
+        <w:t xml:space="preserve"> oraz </w:t>
+      </w:r>
+      <w:proofErr w:type="spellStart"/>
+      <w:r>
+        <w:rPr>
+          <w:b/>
+          <w:sz w:val="24"/>
+          <w:szCs w:val="24"/>
+        </w:rPr>
+        <w:t>ChatGPT</w:t>
+      </w:r>
+      <w:proofErr w:type="spellEnd"/>
+      <w:r>
+        <w:rPr>
+          <w:b/>
+          <w:sz w:val="24"/>
+          <w:szCs w:val="24"/>
+        </w:rPr>
+        <w:t>, oba modele n</w:t>
       </w:r>
     </w:p>
     <w:p>
@@ -9851,6 +11544,7 @@
           <w:sz w:val="24"/>
           <w:szCs w:val="24"/>
         </w:rPr>
+        <w:lastRenderedPageBreak/>
         <w:t>Uwaga:</w:t>
       </w:r>
     </w:p>
@@ -10069,8 +11763,17 @@
           <w:sz w:val="24"/>
           <w:szCs w:val="24"/>
         </w:rPr>
-        <w:t>Visual Paradigm</w:t>
-      </w:r>
+        <w:t xml:space="preserve">Visual </w:t>
+      </w:r>
+      <w:proofErr w:type="spellStart"/>
+      <w:r>
+        <w:rPr>
+          <w:sz w:val="24"/>
+          <w:szCs w:val="24"/>
+        </w:rPr>
+        <w:t>Paradigm</w:t>
+      </w:r>
+      <w:proofErr w:type="spellEnd"/>
       <w:r>
         <w:rPr>
           <w:sz w:val="24"/>
@@ -12629,7 +14332,6 @@
   <w:style w:type="character" w:default="1" w:styleId="Domylnaczcionkaakapitu">
     <w:name w:val="Default Paragraph Font"/>
     <w:uiPriority w:val="1"/>
-    <w:semiHidden/>
     <w:unhideWhenUsed/>
   </w:style>
   <w:style w:type="table" w:default="1" w:styleId="Standardowy">
@@ -12786,6 +14488,19 @@
     <w:rPr>
       <w:color w:val="605E5C"/>
       <w:shd w:val="clear" w:color="auto" w:fill="E1DFDD"/>
+    </w:rPr>
+  </w:style>
+  <w:style w:type="character" w:styleId="HTML-kod">
+    <w:name w:val="HTML Code"/>
+    <w:basedOn w:val="Domylnaczcionkaakapitu"/>
+    <w:uiPriority w:val="99"/>
+    <w:semiHidden/>
+    <w:unhideWhenUsed/>
+    <w:rsid w:val="007B6E57"/>
+    <w:rPr>
+      <w:rFonts w:ascii="Courier New" w:eastAsia="Times New Roman" w:hAnsi="Courier New" w:cs="Courier New"/>
+      <w:sz w:val="20"/>
+      <w:szCs w:val="20"/>
     </w:rPr>
   </w:style>
 </w:styles>
@@ -13075,9 +14790,12 @@
 </file>
 
 <file path=customXml/item1.xml><?xml version="1.0" encoding="utf-8"?>
-<p:properties xmlns:p="http://schemas.microsoft.com/office/2006/metadata/properties" xmlns:xsi="http://www.w3.org/2001/XMLSchema-instance">
-  <documentManagement/>
-</p:properties>
+<?mso-contentType ?>
+<FormTemplates xmlns="http://schemas.microsoft.com/sharepoint/v3/contenttype/forms">
+  <Display>DocumentLibraryForm</Display>
+  <Edit>DocumentLibraryForm</Edit>
+  <New>DocumentLibraryForm</New>
+</FormTemplates>
 </file>
 
 <file path=customXml/item2.xml><?xml version="1.0" encoding="utf-8"?>
@@ -13130,18 +14848,15 @@
 </file>
 
 <file path=customXml/item3.xml><?xml version="1.0" encoding="utf-8"?>
-<?mso-contentType ?>
-<FormTemplates xmlns="http://schemas.microsoft.com/sharepoint/v3/contenttype/forms">
-  <Display>DocumentLibraryForm</Display>
-  <Edit>DocumentLibraryForm</Edit>
-  <New>DocumentLibraryForm</New>
-</FormTemplates>
+<p:properties xmlns:p="http://schemas.microsoft.com/office/2006/metadata/properties" xmlns:xsi="http://www.w3.org/2001/XMLSchema-instance">
+  <documentManagement/>
+</p:properties>
 </file>
 
 <file path=customXml/itemProps1.xml><?xml version="1.0" encoding="utf-8"?>
-<ds:datastoreItem xmlns:ds="http://schemas.openxmlformats.org/officeDocument/2006/customXml" ds:itemID="{30FCD453-2572-4FC6-9DD2-D77772D2ED8E}">
+<ds:datastoreItem xmlns:ds="http://schemas.openxmlformats.org/officeDocument/2006/customXml" ds:itemID="{3ADC55F5-B92E-4690-8D09-6FD1F8A89229}">
   <ds:schemaRefs>
-    <ds:schemaRef ds:uri="http://schemas.microsoft.com/office/2006/metadata/properties"/>
+    <ds:schemaRef ds:uri="http://schemas.microsoft.com/sharepoint/v3/contenttype/forms"/>
   </ds:schemaRefs>
 </ds:datastoreItem>
 </file>
@@ -13162,9 +14877,9 @@
 </file>
 
 <file path=customXml/itemProps3.xml><?xml version="1.0" encoding="utf-8"?>
-<ds:datastoreItem xmlns:ds="http://schemas.openxmlformats.org/officeDocument/2006/customXml" ds:itemID="{3ADC55F5-B92E-4690-8D09-6FD1F8A89229}">
+<ds:datastoreItem xmlns:ds="http://schemas.openxmlformats.org/officeDocument/2006/customXml" ds:itemID="{30FCD453-2572-4FC6-9DD2-D77772D2ED8E}">
   <ds:schemaRefs>
-    <ds:schemaRef ds:uri="http://schemas.microsoft.com/sharepoint/v3/contenttype/forms"/>
+    <ds:schemaRef ds:uri="http://schemas.microsoft.com/office/2006/metadata/properties"/>
   </ds:schemaRefs>
 </ds:datastoreItem>
 </file>
</xml_diff>